<commit_message>
docs: tiếp thu thẩm định độc lập lần 6 (5 hệ AI) — BC tiếp thu lần 6, BC khắc phục v2, TB v9, HD v9, hồ sơ trình thẩm định lần 2
Co-Authored-By: Claude Opus 5.5 <noreply@anthropic.com>
</commit_message>
<xml_diff>
--- a/30-Ket-Qua/2026-10-10/Ra-Soat/BAO-CAO-RA-SOAT-897-CHINH-THUC_Ho-so-trinh-ban-hanh-KTC-Quan-tri_20261010.docx
+++ b/30-Ket-Qua/2026-10-10/Ra-Soat/BAO-CAO-RA-SOAT-897-CHINH-THUC_Ho-so-trinh-ban-hanh-KTC-Quan-tri_20261010.docx
@@ -4540,7 +4540,23 @@
           <w:i w:val="0"/>
           <w:sz w:val="28"/>
         </w:rPr>
-        <w:t>Đã quét lại 3 văn bản sau khi sửa: 0 gợi ý thể thức; 0 gợi ý viện dẫn (12 phép kiểm); 0 vị trí viết thường sau dấu hai chấm; không còn các từ “thí điểm”, “nghiệm thu”, “biên bản” trong Thông báo, Hướng dẫn. Tệp Track Changes hợp lệ: Thông báo 36 dấu vết, Hướng dẫn 26 dấu vết, 02 tác giả.</w:t>
+        <w:t>Đã quét lại 3 văn bản sau khi sửa: 0 gợi ý thể thức; 0 gợi ý viện dẫn (12 phép kiểm); 0 vị trí viết thường sau dấu hai chấm; không còn các từ “thí điểm”, “nghiệm thu”, “biên bản” trong Thông báo, Hướng dẫn. Tệp Track Changes hợp lệ: Thông báo 36 dấu vết, Hướng dẫn 26 dấu vết, 02 tác giả (tại thời điểm rà soát).</w:t>
+      </w:r>
+    </w:p>
+    <w:p>
+      <w:pPr>
+        <w:spacing w:after="60" w:line="276" w:lineRule="auto"/>
+        <w:ind w:firstLine="567"/>
+        <w:jc w:val="both"/>
+      </w:pPr>
+      <w:r>
+        <w:rPr>
+          <w:rFonts w:ascii="Times New Roman" w:hAnsi="Times New Roman"/>
+          <w:b w:val="0"/>
+          <w:i w:val="0"/>
+          <w:sz w:val="28"/>
+        </w:rPr>
+        <w:t>Bổ sung sau rà soát (chiều 10/10/2026): Tiếp thu thẩm định độc lập lần 6, Thông báo được bổ sung 03 chỗ, Hướng dẫn 02 chỗ (tác giả Track Changes “Tiếp thu thẩm định lần 6”), Báo cáo khắc phục lập bản 2, Báo cáo tiếp thu, giải trình lần 6 lập mới. Các phần bổ sung và 02 báo cáo này đã qua kiểm tự động (thể thức, viện dẫn, viết hoa sau dấu hai chấm: 0 gợi ý), chưa rà soát lại toàn văn theo quy trình chính thức.</w:t>
       </w:r>
     </w:p>
     <w:p>

</xml_diff>